<commit_message>
set up custody order Parenting Time field and addendum
</commit_message>
<xml_diff>
--- a/docassemble/MLHDivorceAndCustody/data/templates/judgment_addendum_parenting_time.docx
+++ b/docassemble/MLHDivorceAndCustody/data/templates/judgment_addendum_parenting_time.docx
@@ -144,7 +144,6 @@
                 <w:sz w:val="20"/>
               </w:rPr>
             </w:pPr>
-            <w:proofErr w:type="gramStart"/>
             <w:r>
               <w:rPr>
                 <w:bCs/>
@@ -158,39 +157,7 @@
                 <w:bCs/>
                 <w:sz w:val="20"/>
               </w:rPr>
-              <w:t>the</w:t>
-            </w:r>
-            <w:proofErr w:type="gramEnd"/>
-            <w:r>
-              <w:rPr>
-                <w:bCs/>
-                <w:sz w:val="20"/>
-              </w:rPr>
-              <w:t>_</w:t>
-            </w:r>
-            <w:proofErr w:type="gramStart"/>
-            <w:r>
-              <w:rPr>
-                <w:bCs/>
-                <w:sz w:val="20"/>
-              </w:rPr>
-              <w:t>court.address</w:t>
-            </w:r>
-            <w:proofErr w:type="gramEnd"/>
-            <w:r>
-              <w:rPr>
-                <w:bCs/>
-                <w:sz w:val="20"/>
-              </w:rPr>
-              <w:t>.on_one_</w:t>
-            </w:r>
-            <w:proofErr w:type="gramStart"/>
-            <w:r>
-              <w:rPr>
-                <w:bCs/>
-                <w:sz w:val="20"/>
-              </w:rPr>
-              <w:t>line</w:t>
+              <w:t>the_court.address.on_one_line</w:t>
             </w:r>
             <w:proofErr w:type="spellEnd"/>
             <w:r>
@@ -198,15 +165,7 @@
                 <w:bCs/>
                 <w:sz w:val="20"/>
               </w:rPr>
-              <w:t>(</w:t>
-            </w:r>
-            <w:proofErr w:type="gramEnd"/>
-            <w:r>
-              <w:rPr>
-                <w:bCs/>
-                <w:sz w:val="20"/>
-              </w:rPr>
-              <w:t>) }}</w:t>
+              <w:t>() }}</w:t>
             </w:r>
           </w:p>
         </w:tc>
@@ -222,7 +181,6 @@
                 <w:sz w:val="20"/>
               </w:rPr>
             </w:pPr>
-            <w:proofErr w:type="gramStart"/>
             <w:r>
               <w:rPr>
                 <w:bCs/>
@@ -236,26 +194,9 @@
                 <w:bCs/>
                 <w:sz w:val="20"/>
               </w:rPr>
-              <w:t>the</w:t>
-            </w:r>
-            <w:proofErr w:type="gramEnd"/>
-            <w:r>
-              <w:rPr>
-                <w:bCs/>
-                <w:sz w:val="20"/>
-              </w:rPr>
-              <w:t>_</w:t>
-            </w:r>
-            <w:proofErr w:type="gramStart"/>
-            <w:r>
-              <w:rPr>
-                <w:bCs/>
-                <w:sz w:val="20"/>
-              </w:rPr>
-              <w:t>court.phone</w:t>
+              <w:t>the_court.phone</w:t>
             </w:r>
             <w:proofErr w:type="spellEnd"/>
-            <w:proofErr w:type="gramEnd"/>
             <w:r>
               <w:rPr>
                 <w:bCs/>
@@ -359,7 +300,6 @@
                                 <w:szCs w:val="20"/>
                               </w:rPr>
                             </w:pPr>
-                            <w:proofErr w:type="gramStart"/>
                             <w:r>
                               <w:rPr>
                                 <w:color w:val="231F20"/>
@@ -367,17 +307,7 @@
                                 <w:sz w:val="20"/>
                                 <w:szCs w:val="20"/>
                               </w:rPr>
-                              <w:t>{{ defendants</w:t>
-                            </w:r>
-                            <w:proofErr w:type="gramEnd"/>
-                            <w:r>
-                              <w:rPr>
-                                <w:color w:val="231F20"/>
-                                <w:spacing w:val="-4"/>
-                                <w:sz w:val="20"/>
-                                <w:szCs w:val="20"/>
-                              </w:rPr>
-                              <w:t xml:space="preserve"> }}</w:t>
+                              <w:t>{{ defendants }}</w:t>
                             </w:r>
                           </w:p>
                         </w:txbxContent>
@@ -552,7 +482,6 @@
                                 <w:szCs w:val="20"/>
                               </w:rPr>
                             </w:pPr>
-                            <w:proofErr w:type="gramStart"/>
                             <w:r>
                               <w:rPr>
                                 <w:color w:val="231F20"/>
@@ -560,17 +489,7 @@
                                 <w:sz w:val="20"/>
                                 <w:szCs w:val="20"/>
                               </w:rPr>
-                              <w:t>{{ plaintiffs</w:t>
-                            </w:r>
-                            <w:proofErr w:type="gramEnd"/>
-                            <w:r>
-                              <w:rPr>
-                                <w:color w:val="231F20"/>
-                                <w:spacing w:val="-4"/>
-                                <w:sz w:val="20"/>
-                                <w:szCs w:val="20"/>
-                              </w:rPr>
-                              <w:t xml:space="preserve"> }}</w:t>
+                              <w:t>{{ plaintiffs }}</w:t>
                             </w:r>
                           </w:p>
                         </w:txbxContent>
@@ -720,6 +639,17 @@
         </w:rPr>
         <w:t xml:space="preserve">{%p if </w:t>
       </w:r>
+      <w:r>
+        <w:rPr>
+          <w:b w:val="0"/>
+          <w:bCs w:val="0"/>
+          <w:color w:val="231F20"/>
+          <w:spacing w:val="-10"/>
+          <w:sz w:val="22"/>
+          <w:szCs w:val="22"/>
+        </w:rPr>
+        <w:t>(</w:t>
+      </w:r>
       <w:proofErr w:type="spellStart"/>
       <w:r>
         <w:rPr>
@@ -730,6 +660,100 @@
           <w:sz w:val="22"/>
           <w:szCs w:val="22"/>
         </w:rPr>
+        <w:t>tool_ID</w:t>
+      </w:r>
+      <w:proofErr w:type="spellEnd"/>
+      <w:r>
+        <w:rPr>
+          <w:b w:val="0"/>
+          <w:bCs w:val="0"/>
+          <w:color w:val="231F20"/>
+          <w:spacing w:val="-10"/>
+          <w:sz w:val="22"/>
+          <w:szCs w:val="22"/>
+        </w:rPr>
+        <w:t xml:space="preserve"> in [“</w:t>
+      </w:r>
+      <w:proofErr w:type="spellStart"/>
+      <w:r>
+        <w:rPr>
+          <w:b w:val="0"/>
+          <w:bCs w:val="0"/>
+          <w:color w:val="231F20"/>
+          <w:spacing w:val="-10"/>
+          <w:sz w:val="22"/>
+          <w:szCs w:val="22"/>
+        </w:rPr>
+        <w:t>divorce_complaint</w:t>
+      </w:r>
+      <w:proofErr w:type="spellEnd"/>
+      <w:r>
+        <w:rPr>
+          <w:b w:val="0"/>
+          <w:bCs w:val="0"/>
+          <w:color w:val="231F20"/>
+          <w:spacing w:val="-10"/>
+          <w:sz w:val="22"/>
+          <w:szCs w:val="22"/>
+        </w:rPr>
+        <w:t>”, “</w:t>
+      </w:r>
+      <w:proofErr w:type="spellStart"/>
+      <w:r>
+        <w:rPr>
+          <w:b w:val="0"/>
+          <w:bCs w:val="0"/>
+          <w:color w:val="231F20"/>
+          <w:spacing w:val="-10"/>
+          <w:sz w:val="22"/>
+          <w:szCs w:val="22"/>
+        </w:rPr>
+        <w:t>JOD_only</w:t>
+      </w:r>
+      <w:proofErr w:type="spellEnd"/>
+      <w:r>
+        <w:rPr>
+          <w:b w:val="0"/>
+          <w:bCs w:val="0"/>
+          <w:color w:val="231F20"/>
+          <w:spacing w:val="-10"/>
+          <w:sz w:val="22"/>
+          <w:szCs w:val="22"/>
+        </w:rPr>
+        <w:t>”</w:t>
+      </w:r>
+      <w:r>
+        <w:rPr>
+          <w:b w:val="0"/>
+          <w:bCs w:val="0"/>
+          <w:color w:val="231F20"/>
+          <w:spacing w:val="-10"/>
+          <w:sz w:val="22"/>
+          <w:szCs w:val="22"/>
+        </w:rPr>
+        <w:t>]</w:t>
+      </w:r>
+      <w:r>
+        <w:rPr>
+          <w:b w:val="0"/>
+          <w:bCs w:val="0"/>
+          <w:color w:val="231F20"/>
+          <w:spacing w:val="-10"/>
+          <w:sz w:val="22"/>
+          <w:szCs w:val="22"/>
+        </w:rPr>
+        <w:t xml:space="preserve"> and </w:t>
+      </w:r>
+      <w:proofErr w:type="spellStart"/>
+      <w:r>
+        <w:rPr>
+          <w:b w:val="0"/>
+          <w:bCs w:val="0"/>
+          <w:color w:val="231F20"/>
+          <w:spacing w:val="-10"/>
+          <w:sz w:val="22"/>
+          <w:szCs w:val="22"/>
+        </w:rPr>
         <w:t>custom_PT_details</w:t>
       </w:r>
       <w:proofErr w:type="spellEnd"/>
@@ -764,7 +788,112 @@
           <w:sz w:val="22"/>
           <w:szCs w:val="22"/>
         </w:rPr>
-        <w:t>0 %}</w:t>
+        <w:t>0</w:t>
+      </w:r>
+      <w:r>
+        <w:rPr>
+          <w:b w:val="0"/>
+          <w:bCs w:val="0"/>
+          <w:color w:val="231F20"/>
+          <w:spacing w:val="-10"/>
+          <w:sz w:val="22"/>
+          <w:szCs w:val="22"/>
+        </w:rPr>
+        <w:t>) or (</w:t>
+      </w:r>
+      <w:proofErr w:type="spellStart"/>
+      <w:r>
+        <w:rPr>
+          <w:b w:val="0"/>
+          <w:bCs w:val="0"/>
+          <w:color w:val="231F20"/>
+          <w:spacing w:val="-10"/>
+          <w:sz w:val="22"/>
+          <w:szCs w:val="22"/>
+        </w:rPr>
+        <w:t>tool_ID</w:t>
+      </w:r>
+      <w:proofErr w:type="spellEnd"/>
+      <w:r>
+        <w:rPr>
+          <w:b w:val="0"/>
+          <w:bCs w:val="0"/>
+          <w:color w:val="231F20"/>
+          <w:spacing w:val="-10"/>
+          <w:sz w:val="22"/>
+          <w:szCs w:val="22"/>
+        </w:rPr>
+        <w:t xml:space="preserve"> == “</w:t>
+      </w:r>
+      <w:proofErr w:type="spellStart"/>
+      <w:r>
+        <w:rPr>
+          <w:b w:val="0"/>
+          <w:bCs w:val="0"/>
+          <w:color w:val="231F20"/>
+          <w:spacing w:val="-10"/>
+          <w:sz w:val="22"/>
+          <w:szCs w:val="22"/>
+        </w:rPr>
+        <w:t>custody_complaint</w:t>
+      </w:r>
+      <w:proofErr w:type="spellEnd"/>
+      <w:r>
+        <w:rPr>
+          <w:b w:val="0"/>
+          <w:bCs w:val="0"/>
+          <w:color w:val="231F20"/>
+          <w:spacing w:val="-10"/>
+          <w:sz w:val="22"/>
+          <w:szCs w:val="22"/>
+        </w:rPr>
+        <w:t xml:space="preserve">” and </w:t>
+      </w:r>
+      <w:proofErr w:type="spellStart"/>
+      <w:r>
+        <w:rPr>
+          <w:b w:val="0"/>
+          <w:bCs w:val="0"/>
+          <w:color w:val="231F20"/>
+          <w:spacing w:val="-10"/>
+          <w:sz w:val="22"/>
+          <w:szCs w:val="22"/>
+        </w:rPr>
+        <w:t>custom_PT_details</w:t>
+      </w:r>
+      <w:proofErr w:type="spellEnd"/>
+      <w:r>
+        <w:rPr>
+          <w:b w:val="0"/>
+          <w:bCs w:val="0"/>
+          <w:color w:val="231F20"/>
+          <w:spacing w:val="-10"/>
+          <w:sz w:val="22"/>
+          <w:szCs w:val="22"/>
+        </w:rPr>
+        <w:t xml:space="preserve"> | length &gt; </w:t>
+      </w:r>
+      <w:r>
+        <w:rPr>
+          <w:b w:val="0"/>
+          <w:bCs w:val="0"/>
+          <w:color w:val="231F20"/>
+          <w:spacing w:val="-10"/>
+          <w:sz w:val="22"/>
+          <w:szCs w:val="22"/>
+        </w:rPr>
+        <w:t>275)</w:t>
+      </w:r>
+      <w:r>
+        <w:rPr>
+          <w:b w:val="0"/>
+          <w:bCs w:val="0"/>
+          <w:color w:val="231F20"/>
+          <w:spacing w:val="-10"/>
+          <w:sz w:val="22"/>
+          <w:szCs w:val="22"/>
+        </w:rPr>
+        <w:t xml:space="preserve"> %}</w:t>
       </w:r>
     </w:p>
     <w:p>
@@ -803,7 +932,6 @@
           <w:szCs w:val="22"/>
         </w:rPr>
       </w:pPr>
-      <w:proofErr w:type="gramStart"/>
       <w:r>
         <w:rPr>
           <w:b w:val="0"/>
@@ -825,31 +953,7 @@
           <w:sz w:val="22"/>
           <w:szCs w:val="22"/>
         </w:rPr>
-        <w:t>custom</w:t>
-      </w:r>
-      <w:proofErr w:type="gramEnd"/>
-      <w:r>
-        <w:rPr>
-          <w:b w:val="0"/>
-          <w:bCs w:val="0"/>
-          <w:color w:val="231F20"/>
-          <w:spacing w:val="-10"/>
-          <w:sz w:val="22"/>
-          <w:szCs w:val="22"/>
-        </w:rPr>
-        <w:t>_PT_</w:t>
-      </w:r>
-      <w:proofErr w:type="gramStart"/>
-      <w:r>
-        <w:rPr>
-          <w:b w:val="0"/>
-          <w:bCs w:val="0"/>
-          <w:color w:val="231F20"/>
-          <w:spacing w:val="-10"/>
-          <w:sz w:val="22"/>
-          <w:szCs w:val="22"/>
-        </w:rPr>
-        <w:t>details</w:t>
+        <w:t>custom_PT_details</w:t>
       </w:r>
       <w:proofErr w:type="spellEnd"/>
       <w:r>
@@ -861,19 +965,7 @@
           <w:sz w:val="22"/>
           <w:szCs w:val="22"/>
         </w:rPr>
-        <w:t xml:space="preserve"> }</w:t>
-      </w:r>
-      <w:proofErr w:type="gramEnd"/>
-      <w:r>
-        <w:rPr>
-          <w:b w:val="0"/>
-          <w:bCs w:val="0"/>
-          <w:color w:val="231F20"/>
-          <w:spacing w:val="-10"/>
-          <w:sz w:val="22"/>
-          <w:szCs w:val="22"/>
-        </w:rPr>
-        <w:t>}</w:t>
+        <w:t xml:space="preserve"> }}</w:t>
       </w:r>
     </w:p>
     <w:p>
@@ -1014,19 +1106,7 @@
           <w:sz w:val="22"/>
           <w:szCs w:val="22"/>
         </w:rPr>
-        <w:t xml:space="preserve">Parenting time for </w:t>
-      </w:r>
-      <w:proofErr w:type="gramStart"/>
-      <w:r>
-        <w:rPr>
-          <w:b w:val="0"/>
-          <w:bCs w:val="0"/>
-          <w:color w:val="231F20"/>
-          <w:spacing w:val="-10"/>
-          <w:sz w:val="22"/>
-          <w:szCs w:val="22"/>
-        </w:rPr>
-        <w:t xml:space="preserve">{{ </w:t>
+        <w:t xml:space="preserve">Parenting time for {{ </w:t>
       </w:r>
       <w:proofErr w:type="spellStart"/>
       <w:r>
@@ -1038,19 +1118,7 @@
           <w:sz w:val="22"/>
           <w:szCs w:val="22"/>
         </w:rPr>
-        <w:t>OP</w:t>
-      </w:r>
-      <w:proofErr w:type="gramEnd"/>
-      <w:r>
-        <w:rPr>
-          <w:b w:val="0"/>
-          <w:bCs w:val="0"/>
-          <w:color w:val="231F20"/>
-          <w:spacing w:val="-10"/>
-          <w:sz w:val="22"/>
-          <w:szCs w:val="22"/>
-        </w:rPr>
-        <w:t>_party_label</w:t>
+        <w:t>OP_party_label</w:t>
       </w:r>
       <w:proofErr w:type="spellEnd"/>
       <w:r>
@@ -1062,43 +1130,7 @@
           <w:sz w:val="22"/>
           <w:szCs w:val="22"/>
         </w:rPr>
-        <w:t xml:space="preserve"> | </w:t>
-      </w:r>
-      <w:proofErr w:type="gramStart"/>
-      <w:r>
-        <w:rPr>
-          <w:b w:val="0"/>
-          <w:bCs w:val="0"/>
-          <w:color w:val="231F20"/>
-          <w:spacing w:val="-10"/>
-          <w:sz w:val="22"/>
-          <w:szCs w:val="22"/>
-        </w:rPr>
-        <w:t>lower }</w:t>
-      </w:r>
-      <w:proofErr w:type="gramEnd"/>
-      <w:r>
-        <w:rPr>
-          <w:b w:val="0"/>
-          <w:bCs w:val="0"/>
-          <w:color w:val="231F20"/>
-          <w:spacing w:val="-10"/>
-          <w:sz w:val="22"/>
-          <w:szCs w:val="22"/>
-        </w:rPr>
-        <w:t xml:space="preserve">} will be supervised by </w:t>
-      </w:r>
-      <w:proofErr w:type="gramStart"/>
-      <w:r>
-        <w:rPr>
-          <w:b w:val="0"/>
-          <w:bCs w:val="0"/>
-          <w:color w:val="231F20"/>
-          <w:spacing w:val="-10"/>
-          <w:sz w:val="22"/>
-          <w:szCs w:val="22"/>
-        </w:rPr>
-        <w:t xml:space="preserve">{{ </w:t>
+        <w:t xml:space="preserve"> | lower }} will be supervised by {{ </w:t>
       </w:r>
       <w:proofErr w:type="spellStart"/>
       <w:r>
@@ -1110,19 +1142,7 @@
           <w:sz w:val="22"/>
           <w:szCs w:val="22"/>
         </w:rPr>
-        <w:t>PT</w:t>
-      </w:r>
-      <w:proofErr w:type="gramEnd"/>
-      <w:r>
-        <w:rPr>
-          <w:b w:val="0"/>
-          <w:bCs w:val="0"/>
-          <w:color w:val="231F20"/>
-          <w:spacing w:val="-10"/>
-          <w:sz w:val="22"/>
-          <w:szCs w:val="22"/>
-        </w:rPr>
-        <w:t>_supervisor</w:t>
+        <w:t>PT_supervisor</w:t>
       </w:r>
       <w:proofErr w:type="spellEnd"/>
       <w:r>
@@ -1146,19 +1166,7 @@
           <w:sz w:val="22"/>
           <w:szCs w:val="22"/>
         </w:rPr>
-        <w:t>PT_</w:t>
-      </w:r>
-      <w:proofErr w:type="gramStart"/>
-      <w:r>
-        <w:rPr>
-          <w:b w:val="0"/>
-          <w:bCs w:val="0"/>
-          <w:color w:val="231F20"/>
-          <w:spacing w:val="-10"/>
-          <w:sz w:val="22"/>
-          <w:szCs w:val="22"/>
-        </w:rPr>
-        <w:t>supervisor</w:t>
+        <w:t>PT_supervisor</w:t>
       </w:r>
       <w:proofErr w:type="spellEnd"/>
       <w:r>
@@ -1170,43 +1178,7 @@
           <w:sz w:val="22"/>
           <w:szCs w:val="22"/>
         </w:rPr>
-        <w:t xml:space="preserve"> !</w:t>
-      </w:r>
-      <w:proofErr w:type="gramEnd"/>
-      <w:r>
-        <w:rPr>
-          <w:b w:val="0"/>
-          <w:bCs w:val="0"/>
-          <w:color w:val="231F20"/>
-          <w:spacing w:val="-10"/>
-          <w:sz w:val="22"/>
-          <w:szCs w:val="22"/>
-        </w:rPr>
-        <w:t>= “” else “________________________</w:t>
-      </w:r>
-      <w:proofErr w:type="gramStart"/>
-      <w:r>
-        <w:rPr>
-          <w:b w:val="0"/>
-          <w:bCs w:val="0"/>
-          <w:color w:val="231F20"/>
-          <w:spacing w:val="-10"/>
-          <w:sz w:val="22"/>
-          <w:szCs w:val="22"/>
-        </w:rPr>
-        <w:t>” }</w:t>
-      </w:r>
-      <w:proofErr w:type="gramEnd"/>
-      <w:r>
-        <w:rPr>
-          <w:b w:val="0"/>
-          <w:bCs w:val="0"/>
-          <w:color w:val="231F20"/>
-          <w:spacing w:val="-10"/>
-          <w:sz w:val="22"/>
-          <w:szCs w:val="22"/>
-        </w:rPr>
-        <w:t>}.</w:t>
+        <w:t xml:space="preserve"> != “” else “________________________” }}.</w:t>
       </w:r>
     </w:p>
     <w:p>
@@ -1345,19 +1317,7 @@
           <w:sz w:val="22"/>
           <w:szCs w:val="22"/>
         </w:rPr>
-        <w:t xml:space="preserve">Parenting time for </w:t>
-      </w:r>
-      <w:proofErr w:type="gramStart"/>
-      <w:r>
-        <w:rPr>
-          <w:b w:val="0"/>
-          <w:bCs w:val="0"/>
-          <w:color w:val="231F20"/>
-          <w:spacing w:val="-10"/>
-          <w:sz w:val="22"/>
-          <w:szCs w:val="22"/>
-        </w:rPr>
-        <w:t xml:space="preserve">{{ </w:t>
+        <w:t xml:space="preserve">Parenting time for {{ </w:t>
       </w:r>
       <w:proofErr w:type="spellStart"/>
       <w:r>
@@ -1369,19 +1329,7 @@
           <w:sz w:val="22"/>
           <w:szCs w:val="22"/>
         </w:rPr>
-        <w:t>user</w:t>
-      </w:r>
-      <w:proofErr w:type="gramEnd"/>
-      <w:r>
-        <w:rPr>
-          <w:b w:val="0"/>
-          <w:bCs w:val="0"/>
-          <w:color w:val="231F20"/>
-          <w:spacing w:val="-10"/>
-          <w:sz w:val="22"/>
-          <w:szCs w:val="22"/>
-        </w:rPr>
-        <w:t>_party_label</w:t>
+        <w:t>user_party_label</w:t>
       </w:r>
       <w:proofErr w:type="spellEnd"/>
       <w:r>
@@ -1393,43 +1341,7 @@
           <w:sz w:val="22"/>
           <w:szCs w:val="22"/>
         </w:rPr>
-        <w:t xml:space="preserve"> | </w:t>
-      </w:r>
-      <w:proofErr w:type="gramStart"/>
-      <w:r>
-        <w:rPr>
-          <w:b w:val="0"/>
-          <w:bCs w:val="0"/>
-          <w:color w:val="231F20"/>
-          <w:spacing w:val="-10"/>
-          <w:sz w:val="22"/>
-          <w:szCs w:val="22"/>
-        </w:rPr>
-        <w:t>lower }</w:t>
-      </w:r>
-      <w:proofErr w:type="gramEnd"/>
-      <w:r>
-        <w:rPr>
-          <w:b w:val="0"/>
-          <w:bCs w:val="0"/>
-          <w:color w:val="231F20"/>
-          <w:spacing w:val="-10"/>
-          <w:sz w:val="22"/>
-          <w:szCs w:val="22"/>
-        </w:rPr>
-        <w:t xml:space="preserve">} will be supervised by </w:t>
-      </w:r>
-      <w:proofErr w:type="gramStart"/>
-      <w:r>
-        <w:rPr>
-          <w:b w:val="0"/>
-          <w:bCs w:val="0"/>
-          <w:color w:val="231F20"/>
-          <w:spacing w:val="-10"/>
-          <w:sz w:val="22"/>
-          <w:szCs w:val="22"/>
-        </w:rPr>
-        <w:t xml:space="preserve">{{ </w:t>
+        <w:t xml:space="preserve"> | lower }} will be supervised by {{ </w:t>
       </w:r>
       <w:proofErr w:type="spellStart"/>
       <w:r>
@@ -1441,19 +1353,7 @@
           <w:sz w:val="22"/>
           <w:szCs w:val="22"/>
         </w:rPr>
-        <w:t>PT</w:t>
-      </w:r>
-      <w:proofErr w:type="gramEnd"/>
-      <w:r>
-        <w:rPr>
-          <w:b w:val="0"/>
-          <w:bCs w:val="0"/>
-          <w:color w:val="231F20"/>
-          <w:spacing w:val="-10"/>
-          <w:sz w:val="22"/>
-          <w:szCs w:val="22"/>
-        </w:rPr>
-        <w:t>_supervisor</w:t>
+        <w:t>PT_supervisor</w:t>
       </w:r>
       <w:proofErr w:type="spellEnd"/>
       <w:r>
@@ -1477,19 +1377,7 @@
           <w:sz w:val="22"/>
           <w:szCs w:val="22"/>
         </w:rPr>
-        <w:t>PT_</w:t>
-      </w:r>
-      <w:proofErr w:type="gramStart"/>
-      <w:r>
-        <w:rPr>
-          <w:b w:val="0"/>
-          <w:bCs w:val="0"/>
-          <w:color w:val="231F20"/>
-          <w:spacing w:val="-10"/>
-          <w:sz w:val="22"/>
-          <w:szCs w:val="22"/>
-        </w:rPr>
-        <w:t>supervisor</w:t>
+        <w:t>PT_supervisor</w:t>
       </w:r>
       <w:proofErr w:type="spellEnd"/>
       <w:r>
@@ -1501,43 +1389,7 @@
           <w:sz w:val="22"/>
           <w:szCs w:val="22"/>
         </w:rPr>
-        <w:t xml:space="preserve"> !</w:t>
-      </w:r>
-      <w:proofErr w:type="gramEnd"/>
-      <w:r>
-        <w:rPr>
-          <w:b w:val="0"/>
-          <w:bCs w:val="0"/>
-          <w:color w:val="231F20"/>
-          <w:spacing w:val="-10"/>
-          <w:sz w:val="22"/>
-          <w:szCs w:val="22"/>
-        </w:rPr>
-        <w:t>= “” else “________________________</w:t>
-      </w:r>
-      <w:proofErr w:type="gramStart"/>
-      <w:r>
-        <w:rPr>
-          <w:b w:val="0"/>
-          <w:bCs w:val="0"/>
-          <w:color w:val="231F20"/>
-          <w:spacing w:val="-10"/>
-          <w:sz w:val="22"/>
-          <w:szCs w:val="22"/>
-        </w:rPr>
-        <w:t>” }</w:t>
-      </w:r>
-      <w:proofErr w:type="gramEnd"/>
-      <w:r>
-        <w:rPr>
-          <w:b w:val="0"/>
-          <w:bCs w:val="0"/>
-          <w:color w:val="231F20"/>
-          <w:spacing w:val="-10"/>
-          <w:sz w:val="22"/>
-          <w:szCs w:val="22"/>
-        </w:rPr>
-        <w:t>}.</w:t>
+        <w:t xml:space="preserve"> != “” else “________________________” }}.</w:t>
       </w:r>
     </w:p>
     <w:p>
@@ -1811,7 +1663,6 @@
             </w:rPr>
             <w:t xml:space="preserve"> </w:t>
           </w:r>
-          <w:proofErr w:type="gramStart"/>
           <w:r>
             <w:rPr>
               <w:b/>
@@ -1829,17 +1680,7 @@
               <w:sz w:val="16"/>
               <w:szCs w:val="16"/>
             </w:rPr>
-            <w:t>docket</w:t>
-          </w:r>
-          <w:proofErr w:type="gramEnd"/>
-          <w:r>
-            <w:rPr>
-              <w:b/>
-              <w:color w:val="231F20"/>
-              <w:sz w:val="16"/>
-              <w:szCs w:val="16"/>
-            </w:rPr>
-            <w:t>_number</w:t>
+            <w:t>docket_number</w:t>
           </w:r>
           <w:proofErr w:type="spellEnd"/>
           <w:r>
@@ -1964,7 +1805,6 @@
               <w:szCs w:val="20"/>
             </w:rPr>
           </w:pPr>
-          <w:proofErr w:type="gramStart"/>
           <w:r>
             <w:rPr>
               <w:b/>
@@ -1983,30 +1823,9 @@
               <w:sz w:val="20"/>
               <w:szCs w:val="20"/>
             </w:rPr>
-            <w:t>the</w:t>
-          </w:r>
-          <w:proofErr w:type="gramEnd"/>
-          <w:r>
-            <w:rPr>
-              <w:b/>
-              <w:bCs/>
-              <w:sz w:val="20"/>
-              <w:szCs w:val="20"/>
-            </w:rPr>
-            <w:t>_</w:t>
-          </w:r>
-          <w:proofErr w:type="gramStart"/>
-          <w:r>
-            <w:rPr>
-              <w:b/>
-              <w:bCs/>
-              <w:sz w:val="20"/>
-              <w:szCs w:val="20"/>
-            </w:rPr>
-            <w:t>court.number</w:t>
+            <w:t>the_court.number</w:t>
           </w:r>
           <w:proofErr w:type="spellEnd"/>
-          <w:proofErr w:type="gramEnd"/>
           <w:r>
             <w:rPr>
               <w:b/>
@@ -2037,7 +1856,6 @@
               <w:sz w:val="20"/>
             </w:rPr>
           </w:pPr>
-          <w:proofErr w:type="gramStart"/>
           <w:r>
             <w:rPr>
               <w:b/>
@@ -2056,9 +1874,9 @@
               <w:sz w:val="20"/>
               <w:szCs w:val="20"/>
             </w:rPr>
-            <w:t>county</w:t>
-          </w:r>
-          <w:proofErr w:type="gramEnd"/>
+            <w:t>county_choice.upper</w:t>
+          </w:r>
+          <w:proofErr w:type="spellEnd"/>
           <w:r>
             <w:rPr>
               <w:b/>
@@ -2066,38 +1884,7 @@
               <w:sz w:val="20"/>
               <w:szCs w:val="20"/>
             </w:rPr>
-            <w:t>_</w:t>
-          </w:r>
-          <w:proofErr w:type="gramStart"/>
-          <w:r>
-            <w:rPr>
-              <w:b/>
-              <w:bCs/>
-              <w:sz w:val="20"/>
-              <w:szCs w:val="20"/>
-            </w:rPr>
-            <w:t>choice.upper</w:t>
-          </w:r>
-          <w:proofErr w:type="spellEnd"/>
-          <w:proofErr w:type="gramEnd"/>
-          <w:r>
-            <w:rPr>
-              <w:b/>
-              <w:bCs/>
-              <w:sz w:val="20"/>
-              <w:szCs w:val="20"/>
-            </w:rPr>
-            <w:t>(</w:t>
-          </w:r>
-          <w:proofErr w:type="gramStart"/>
-          <w:r>
-            <w:rPr>
-              <w:b/>
-              <w:bCs/>
-              <w:sz w:val="20"/>
-              <w:szCs w:val="20"/>
-            </w:rPr>
-            <w:t>)</w:t>
+            <w:t>()</w:t>
           </w:r>
           <w:r>
             <w:rPr>
@@ -2107,18 +1894,7 @@
               <w:sz w:val="20"/>
               <w:szCs w:val="20"/>
             </w:rPr>
-            <w:t xml:space="preserve"> }</w:t>
-          </w:r>
-          <w:proofErr w:type="gramEnd"/>
-          <w:r>
-            <w:rPr>
-              <w:b/>
-              <w:bCs/>
-              <w:caps/>
-              <w:sz w:val="20"/>
-              <w:szCs w:val="20"/>
-            </w:rPr>
-            <w:t xml:space="preserve">} </w:t>
+            <w:t xml:space="preserve"> }} </w:t>
           </w:r>
           <w:r>
             <w:rPr>
@@ -2139,7 +1915,6 @@
           <w:pPr>
             <w:pStyle w:val="TableParagraph"/>
             <w:spacing w:before="120" w:line="276" w:lineRule="auto"/>
-            <w:ind w:left="0"/>
             <w:jc w:val="center"/>
             <w:rPr>
               <w:b/>
@@ -2153,13 +1928,22 @@
               <w:color w:val="231F20"/>
               <w:sz w:val="20"/>
             </w:rPr>
-            <w:t>JUDGMENT</w:t>
-          </w:r>
-          <w:r>
-            <w:rPr>
-              <w:b/>
-              <w:color w:val="231F20"/>
-              <w:spacing w:val="-23"/>
+            <w:t xml:space="preserve">{% if </w:t>
+          </w:r>
+          <w:proofErr w:type="spellStart"/>
+          <w:r>
+            <w:rPr>
+              <w:b/>
+              <w:color w:val="231F20"/>
+              <w:sz w:val="20"/>
+            </w:rPr>
+            <w:t>tool_ID</w:t>
+          </w:r>
+          <w:proofErr w:type="spellEnd"/>
+          <w:r>
+            <w:rPr>
+              <w:b/>
+              <w:color w:val="231F20"/>
               <w:sz w:val="20"/>
             </w:rPr>
             <w:t xml:space="preserve"> </w:t>
@@ -2170,27 +1954,102 @@
               <w:color w:val="231F20"/>
               <w:sz w:val="20"/>
             </w:rPr>
-            <w:t>OF DIVORCE</w:t>
-          </w:r>
-          <w:r>
-            <w:rPr>
-              <w:b/>
-              <w:color w:val="231F20"/>
-              <w:sz w:val="20"/>
-            </w:rPr>
-            <w:t>,</w:t>
+            <w:t>in</w:t>
+          </w:r>
+          <w:r>
+            <w:rPr>
+              <w:b/>
+              <w:color w:val="231F20"/>
+              <w:sz w:val="20"/>
+            </w:rPr>
+            <w:t xml:space="preserve"> </w:t>
+          </w:r>
+          <w:r>
+            <w:rPr>
+              <w:b/>
+              <w:color w:val="231F20"/>
+              <w:sz w:val="20"/>
+            </w:rPr>
+            <w:t>[</w:t>
+          </w:r>
+          <w:r>
+            <w:rPr>
+              <w:b/>
+              <w:color w:val="231F20"/>
+              <w:sz w:val="20"/>
+            </w:rPr>
+            <w:t>“</w:t>
+          </w:r>
+          <w:proofErr w:type="spellStart"/>
+          <w:r>
+            <w:rPr>
+              <w:b/>
+              <w:color w:val="231F20"/>
+              <w:sz w:val="20"/>
+            </w:rPr>
+            <w:t>divorce_complaint</w:t>
+          </w:r>
+          <w:proofErr w:type="spellEnd"/>
+          <w:r>
+            <w:rPr>
+              <w:b/>
+              <w:color w:val="231F20"/>
+              <w:sz w:val="20"/>
+            </w:rPr>
+            <w:t>”</w:t>
+          </w:r>
+          <w:r>
+            <w:rPr>
+              <w:b/>
+              <w:color w:val="231F20"/>
+              <w:sz w:val="20"/>
+            </w:rPr>
+            <w:t>, “</w:t>
+          </w:r>
+          <w:proofErr w:type="spellStart"/>
+          <w:r>
+            <w:rPr>
+              <w:b/>
+              <w:color w:val="231F20"/>
+              <w:sz w:val="20"/>
+            </w:rPr>
+            <w:t>JOD_only</w:t>
+          </w:r>
+          <w:proofErr w:type="spellEnd"/>
+          <w:r>
+            <w:rPr>
+              <w:b/>
+              <w:color w:val="231F20"/>
+              <w:sz w:val="20"/>
+            </w:rPr>
+            <w:t>”]</w:t>
+          </w:r>
+          <w:r>
+            <w:rPr>
+              <w:b/>
+              <w:color w:val="231F20"/>
+              <w:sz w:val="20"/>
+            </w:rPr>
+            <w:t xml:space="preserve"> %}</w:t>
+          </w:r>
+          <w:r>
+            <w:rPr>
+              <w:b/>
+              <w:color w:val="231F20"/>
+              <w:sz w:val="20"/>
+            </w:rPr>
+            <w:t>JUDGMENT OF DIVORCE,</w:t>
           </w:r>
         </w:p>
         <w:p>
           <w:pPr>
             <w:pStyle w:val="TableParagraph"/>
-            <w:spacing w:before="14" w:line="276" w:lineRule="auto"/>
+            <w:spacing w:before="0" w:line="276" w:lineRule="auto"/>
             <w:ind w:left="0"/>
             <w:jc w:val="center"/>
             <w:rPr>
               <w:b/>
               <w:color w:val="231F20"/>
-              <w:spacing w:val="-6"/>
               <w:sz w:val="20"/>
             </w:rPr>
           </w:pPr>
@@ -2201,12 +2060,119 @@
               <w:sz w:val="20"/>
             </w:rPr>
             <w:t>WITH CHILDREN</w:t>
+          </w:r>
+          <w:r>
+            <w:rPr>
+              <w:b/>
+              <w:color w:val="231F20"/>
+              <w:sz w:val="20"/>
+            </w:rPr>
+            <w:t xml:space="preserve">{% </w:t>
+          </w:r>
+          <w:proofErr w:type="spellStart"/>
+          <w:r>
+            <w:rPr>
+              <w:b/>
+              <w:color w:val="231F20"/>
+              <w:sz w:val="20"/>
+            </w:rPr>
+            <w:t>elif</w:t>
+          </w:r>
+          <w:proofErr w:type="spellEnd"/>
+          <w:r>
+            <w:rPr>
+              <w:b/>
+              <w:color w:val="231F20"/>
+              <w:sz w:val="20"/>
+            </w:rPr>
+            <w:t xml:space="preserve"> </w:t>
+          </w:r>
+          <w:proofErr w:type="spellStart"/>
+          <w:r>
+            <w:rPr>
+              <w:b/>
+              <w:color w:val="231F20"/>
+              <w:sz w:val="20"/>
+            </w:rPr>
+            <w:t>tool_ID</w:t>
+          </w:r>
+          <w:proofErr w:type="spellEnd"/>
+          <w:r>
+            <w:rPr>
+              <w:b/>
+              <w:color w:val="231F20"/>
+              <w:sz w:val="20"/>
+            </w:rPr>
+            <w:t xml:space="preserve"> == “</w:t>
+          </w:r>
+          <w:proofErr w:type="spellStart"/>
+          <w:r>
+            <w:rPr>
+              <w:b/>
+              <w:color w:val="231F20"/>
+              <w:sz w:val="20"/>
+            </w:rPr>
+            <w:t>custody_complaint</w:t>
+          </w:r>
+          <w:proofErr w:type="spellEnd"/>
+          <w:r>
+            <w:rPr>
+              <w:b/>
+              <w:color w:val="231F20"/>
+              <w:sz w:val="20"/>
+            </w:rPr>
+            <w:t>” %}</w:t>
+          </w:r>
+          <w:r>
+            <w:rPr>
+              <w:b/>
+              <w:color w:val="231F20"/>
+              <w:sz w:val="20"/>
+            </w:rPr>
+            <w:t>ORDER</w:t>
+          </w:r>
+          <w:r>
+            <w:rPr>
+              <w:b/>
+              <w:color w:val="231F20"/>
+              <w:sz w:val="20"/>
+            </w:rPr>
+            <w:t xml:space="preserve"> REGARDING</w:t>
           </w:r>
         </w:p>
         <w:p>
           <w:pPr>
             <w:pStyle w:val="TableParagraph"/>
-            <w:spacing w:before="14" w:after="120" w:line="276" w:lineRule="auto"/>
+            <w:spacing w:before="0" w:line="276" w:lineRule="auto"/>
+            <w:ind w:left="0"/>
+            <w:jc w:val="center"/>
+            <w:rPr>
+              <w:b/>
+              <w:color w:val="231F20"/>
+              <w:sz w:val="20"/>
+            </w:rPr>
+          </w:pPr>
+          <w:r>
+            <w:rPr>
+              <w:b/>
+              <w:color w:val="231F20"/>
+              <w:sz w:val="20"/>
+            </w:rPr>
+            <w:t>COMPLAINT FOR CUSTODY</w:t>
+          </w:r>
+          <w:r>
+            <w:rPr>
+              <w:b/>
+              <w:color w:val="231F20"/>
+              <w:sz w:val="20"/>
+            </w:rPr>
+            <w:t xml:space="preserve">{% endif %} </w:t>
+          </w:r>
+        </w:p>
+        <w:p>
+          <w:pPr>
+            <w:pStyle w:val="TableParagraph"/>
+            <w:spacing w:before="0" w:line="276" w:lineRule="auto"/>
             <w:ind w:left="0"/>
             <w:jc w:val="center"/>
             <w:rPr>
@@ -2279,7 +2245,6 @@
               <w:sz w:val="20"/>
             </w:rPr>
           </w:pPr>
-          <w:proofErr w:type="gramStart"/>
           <w:r>
             <w:rPr>
               <w:bCs/>
@@ -2297,17 +2262,7 @@
               <w:spacing w:val="-5"/>
               <w:sz w:val="20"/>
             </w:rPr>
-            <w:t>docket</w:t>
-          </w:r>
-          <w:proofErr w:type="gramEnd"/>
-          <w:r>
-            <w:rPr>
-              <w:bCs/>
-              <w:color w:val="231F20"/>
-              <w:spacing w:val="-5"/>
-              <w:sz w:val="20"/>
-            </w:rPr>
-            <w:t>_number</w:t>
+            <w:t>docket_number</w:t>
           </w:r>
           <w:proofErr w:type="spellEnd"/>
           <w:r>

</xml_diff>